<commit_message>
test: manual MT-04 (Postman collection) passed; Postman screenshots in the User Guide
Co-Authored-By: Claude Opus 5.5 <noreply@anthropic.com>
</commit_message>
<xml_diff>
--- a/docs/user-guide/TA9-User-Guide.docx
+++ b/docs/user-guide/TA9-User-Guide.docx
@@ -7837,6 +7837,69 @@
     </w:p>
     <w:p>
       <w:pPr>
+        <w:spacing w:before="120"/>
+        <w:jc w:val="center"/>
+      </w:pPr>
+      <w:r>
+        <w:drawing>
+          <wp:inline distT="0" distB="0" distL="0" distR="0">
+            <wp:extent cx="6124575" cy="3105150"/>
+            <wp:effectExtent t="0" r="0" b="0" l="0"/>
+            <wp:docPr id="8" name="Postman: the collection in the sidebar, and Create job with its 201 response (Test Results 2/2)" descr="Postman: the collection in the sidebar, and Create job with its 201 response (Test Results 2/2)" title="Postman: the collection in the sidebar, and Create job with its 201 response (Test Results 2/2)"/>
+            <wp:cNvGraphicFramePr>
+              <a:graphicFrameLocks xmlns:a="http://schemas.openxmlformats.org/drawingml/2006/main" noChangeAspect="1"/>
+            </wp:cNvGraphicFramePr>
+            <a:graphic xmlns:a="http://schemas.openxmlformats.org/drawingml/2006/main">
+              <a:graphicData uri="http://schemas.openxmlformats.org/drawingml/2006/picture">
+                <pic:pic xmlns:pic="http://schemas.openxmlformats.org/drawingml/2006/picture">
+                  <pic:nvPicPr>
+                    <pic:cNvPr id="0" name="" descr=""/>
+                    <pic:cNvPicPr>
+                      <a:picLocks noChangeAspect="1" noChangeArrowheads="1"/>
+                    </pic:cNvPicPr>
+                  </pic:nvPicPr>
+                  <pic:blipFill>
+                    <a:blip r:embed="rId15" cstate="none"/>
+                    <a:srcRect/>
+                    <a:stretch>
+                      <a:fillRect/>
+                    </a:stretch>
+                  </pic:blipFill>
+                  <pic:spPr bwMode="auto">
+                    <a:xfrm>
+                      <a:off x="0" y="0"/>
+                      <a:ext cx="6124575" cy="3105150"/>
+                    </a:xfrm>
+                    <a:prstGeom prst="rect">
+                      <a:avLst/>
+                    </a:prstGeom>
+                  </pic:spPr>
+                </pic:pic>
+              </a:graphicData>
+            </a:graphic>
+          </wp:inline>
+        </w:drawing>
+      </w:r>
+    </w:p>
+    <w:p>
+      <w:pPr>
+        <w:spacing w:after="200" w:before="60"/>
+        <w:jc w:val="center"/>
+      </w:pPr>
+      <w:r>
+        <w:rPr>
+          <w:rFonts w:ascii="Calibri" w:cs="Calibri" w:eastAsia="Calibri" w:hAnsi="Calibri"/>
+          <w:i/>
+          <w:iCs/>
+          <w:color w:val="808080"/>
+          <w:sz w:val="18"/>
+          <w:szCs w:val="18"/>
+        </w:rPr>
+        <w:t xml:space="preserve">Postman: the collection in the sidebar, and Create job with its 201 response (Test Results 2/2)</w:t>
+      </w:r>
+    </w:p>
+    <w:p>
+      <w:pPr>
         <w:pStyle w:val="Heading2"/>
       </w:pPr>
       <w:bookmarkStart w:name="_Toc18" w:id="18"/>
@@ -7933,6 +7996,69 @@
           <w:rFonts w:ascii="Calibri" w:cs="Calibri" w:eastAsia="Calibri" w:hAnsi="Calibri"/>
         </w:rPr>
         <w:t xml:space="preserve">Each request is sent in turn, and its checks are marked pass or fail.</w:t>
+      </w:r>
+    </w:p>
+    <w:p>
+      <w:pPr>
+        <w:spacing w:before="120"/>
+        <w:jc w:val="center"/>
+      </w:pPr>
+      <w:r>
+        <w:drawing>
+          <wp:inline distT="0" distB="0" distL="0" distR="0">
+            <wp:extent cx="6124575" cy="3676650"/>
+            <wp:effectExtent t="0" r="0" b="0" l="0"/>
+            <wp:docPr id="9" name="Postman Collection Runner: each request with its status code and checks" descr="Postman Collection Runner: each request with its status code and checks" title="Postman Collection Runner: each request with its status code and checks"/>
+            <wp:cNvGraphicFramePr>
+              <a:graphicFrameLocks xmlns:a="http://schemas.openxmlformats.org/drawingml/2006/main" noChangeAspect="1"/>
+            </wp:cNvGraphicFramePr>
+            <a:graphic xmlns:a="http://schemas.openxmlformats.org/drawingml/2006/main">
+              <a:graphicData uri="http://schemas.openxmlformats.org/drawingml/2006/picture">
+                <pic:pic xmlns:pic="http://schemas.openxmlformats.org/drawingml/2006/picture">
+                  <pic:nvPicPr>
+                    <pic:cNvPr id="0" name="" descr=""/>
+                    <pic:cNvPicPr>
+                      <a:picLocks noChangeAspect="1" noChangeArrowheads="1"/>
+                    </pic:cNvPicPr>
+                  </pic:nvPicPr>
+                  <pic:blipFill>
+                    <a:blip r:embed="rId16" cstate="none"/>
+                    <a:srcRect/>
+                    <a:stretch>
+                      <a:fillRect/>
+                    </a:stretch>
+                  </pic:blipFill>
+                  <pic:spPr bwMode="auto">
+                    <a:xfrm>
+                      <a:off x="0" y="0"/>
+                      <a:ext cx="6124575" cy="3676650"/>
+                    </a:xfrm>
+                    <a:prstGeom prst="rect">
+                      <a:avLst/>
+                    </a:prstGeom>
+                  </pic:spPr>
+                </pic:pic>
+              </a:graphicData>
+            </a:graphic>
+          </wp:inline>
+        </w:drawing>
+      </w:r>
+    </w:p>
+    <w:p>
+      <w:pPr>
+        <w:spacing w:after="200" w:before="60"/>
+        <w:jc w:val="center"/>
+      </w:pPr>
+      <w:r>
+        <w:rPr>
+          <w:rFonts w:ascii="Calibri" w:cs="Calibri" w:eastAsia="Calibri" w:hAnsi="Calibri"/>
+          <w:i/>
+          <w:iCs/>
+          <w:color w:val="808080"/>
+          <w:sz w:val="18"/>
+          <w:szCs w:val="18"/>
+        </w:rPr>
+        <w:t xml:space="preserve">Postman Collection Runner: each request with its status code and checks</w:t>
       </w:r>
     </w:p>
     <w:p>

</xml_diff>